<commit_message>
Fill title-page fields and make Excel discharge charts visible
ТЕМА, group 3012, year 2026 and FIO are filled in Word. Discharge
ScatterCharts now use a 10τр time axis so the exponential is not a spike.

Co-authored-by: itkodovaya <itkodovaya@users.noreply.github.com>
</commit_message>
<xml_diff>
--- a/Daniil/задание 1.docx
+++ b/Daniil/задание 1.docx
@@ -727,7 +727,7 @@
           <w:sz w:val="28"/>
           <w:szCs w:val="28"/>
         </w:rPr>
-        <w:t>ТЕМА</w:t>
+        <w:t>ТЕМА: Заряд и разряд катушки индуктивности</w:t>
       </w:r>
       <w:r>
         <w:rPr>
@@ -735,7 +735,7 @@
           <w:b w:val="0"/>
           <w:i w:val="0"/>
         </w:rPr>
-        <w:t>: _____________________________</w:t>
+        <w:t/>
       </w:r>
       <w:r>
         <w:rPr>
@@ -743,7 +743,7 @@
           <w:b w:val="0"/>
           <w:i w:val="0"/>
         </w:rPr>
-        <w:t>___________________________________</w:t>
+        <w:t/>
       </w:r>
       <w:r>
         <w:rPr>
@@ -751,7 +751,7 @@
           <w:b w:val="0"/>
           <w:i w:val="0"/>
         </w:rPr>
-        <w:t>_</w:t>
+        <w:t/>
       </w:r>
     </w:p>
     <w:p>
@@ -771,7 +771,7 @@
           <w:b w:val="0"/>
           <w:i w:val="0"/>
         </w:rPr>
-        <w:t>_________________________________________________________________</w:t>
+        <w:t/>
       </w:r>
     </w:p>
     <w:p>
@@ -1163,7 +1163,7 @@
           <w:b w:val="0"/>
           <w:i w:val="0"/>
         </w:rPr>
-        <w:t xml:space="preserve"> группы ____</w:t>
+        <w:t xml:space="preserve"> группы 3012</w:t>
       </w:r>
       <w:r>
         <w:rPr>
@@ -1171,7 +1171,7 @@
           <w:b w:val="0"/>
           <w:i w:val="0"/>
         </w:rPr>
-        <w:t>_</w:t>
+        <w:t/>
       </w:r>
       <w:r>
         <w:rPr>
@@ -1179,7 +1179,7 @@
           <w:b w:val="0"/>
           <w:i w:val="0"/>
         </w:rPr>
-        <w:t>___</w:t>
+        <w:t/>
       </w:r>
       <w:r>
         <w:rPr>
@@ -1187,7 +1187,7 @@
           <w:b w:val="0"/>
           <w:i w:val="0"/>
         </w:rPr>
-        <w:t xml:space="preserve">_ </w:t>
+        <w:t xml:space="preserve"/>
       </w:r>
     </w:p>
     <w:p>
@@ -1204,13 +1204,13 @@
         <w:rPr>
           <w:i/>
         </w:rPr>
-        <w:t>________________</w:t>
+        <w:t/>
       </w:r>
       <w:r>
         <w:rPr>
           <w:i/>
         </w:rPr>
-        <w:t>_________________</w:t>
+        <w:t/>
       </w:r>
     </w:p>
     <w:p>
@@ -1605,28 +1605,28 @@
           <w:sz w:val="28"/>
           <w:szCs w:val="28"/>
         </w:rPr>
-        <w:t>Дубна, 20</w:t>
+        <w:t>Дубна, 2026 г.</w:t>
       </w:r>
       <w:r>
         <w:rPr>
           <w:sz w:val="28"/>
           <w:szCs w:val="28"/>
         </w:rPr>
-        <w:t>2</w:t>
+        <w:t/>
       </w:r>
       <w:r>
         <w:rPr>
           <w:sz w:val="28"/>
           <w:szCs w:val="28"/>
         </w:rPr>
-        <w:t>1</w:t>
+        <w:t/>
       </w:r>
       <w:r>
         <w:rPr>
           <w:sz w:val="28"/>
           <w:szCs w:val="28"/>
         </w:rPr>
-        <w:t xml:space="preserve"> г.</w:t>
+        <w:t xml:space="preserve"/>
       </w:r>
     </w:p>
     <w:p>
@@ -10647,7 +10647,7 @@
         <w:rPr>
           <w:sz w:val="28"/>
         </w:rPr>
-        <w:t xml:space="preserve"> = </w:t>
+        <w:t xml:space="preserve"/>
       </w:r>
       <m:oMath>
         <m:r>
@@ -10662,7 +10662,7 @@
         <w:rPr>
           <w:sz w:val="28"/>
         </w:rPr>
-        <w:t xml:space="preserve"> + </w:t>
+        <w:t xml:space="preserve"/>
       </w:r>
       <m:oMath>
         <m:r>
@@ -10677,7 +10677,7 @@
         <w:rPr>
           <w:sz w:val="28"/>
         </w:rPr>
-        <w:t>;</w:t>
+        <w:t/>
       </w:r>
     </w:p>
     <w:p>

</xml_diff>

<commit_message>
Restyle Daniil Excel sheet and rewrite the lab conclusion
Dark headers, gray unused cells, zebra data rows, seventh comparison
chart. Word conclusion rewritten in a shorter student-report tone.

Co-authored-by: itkodovaya <itkodovaya@users.noreply.github.com>
</commit_message>
<xml_diff>
--- a/Daniil/задание 1.docx
+++ b/Daniil/задание 1.docx
@@ -8647,7 +8647,7 @@
         </w:rPr>
       </w:pPr>
       <w:r>
-        <w:t xml:space="preserve">Цель: исследовать переходные процессы в цепи с катушкой индуктивности (нарастание тока при подключении к источнику и спад тока при разряде). По исходным данным рассчитать постоянные времени τз = L/r и τр = L/R, получить законы I(t) и U_L(t) и построить графики в Microsoft Excel.</w:t>
+        <w:t xml:space="preserve">Цель: проследить заряд и разряд катушки индуктивности в данной цепи, получить законы изменения тока и напряжения и оценить время переходного процесса.</w:t>
       </w:r>
       <w:r>
         <w:rPr>
@@ -9938,7 +9938,7 @@
             <w:rFonts w:ascii="Cambria Math" w:hAnsi="Cambria Math"/>
             <w:sz w:val="28"/>
           </w:rPr>
-          <m:t xml:space="preserve">Uз(t) = E · EXP(− t·r/L)     — итоговые выражения, совпадают с формулами Excel</m:t>
+          <m:t xml:space="preserve">Uз(t) = E · EXP(− t·r/L)</m:t>
         </m:r>
       </m:oMath>
       <w:r>
@@ -10031,7 +10031,7 @@
         <w:jc w:val="center"/>
       </w:pPr>
       <w:r>
-        <w:t xml:space="preserve">Рис. 2. Зависимость силы тока и напряжения катушки от времени во время заряда (формулы Excel, базовый режим)</w:t>
+        <w:t xml:space="preserve">Рис. 2. Ток и напряжение на катушке при заряде</w:t>
       </w:r>
       <w:r>
         <w:t/>
@@ -10238,7 +10238,7 @@
           <w:sz w:val="28"/>
           <w:szCs w:val="28"/>
         </w:rPr>
-        <w:t>Разряд катушки после переключения верхнего переключателя в правое положение (контур L–R, источник отключён). В Excel разряд считается отдельным режимом с Iр(0) = E/R.</w:t>
+        <w:t>Разряд катушки после переключения верхнего переключателя в правое положение (контур L–R). Начальный ток разряда принят равным E/R.</w:t>
       </w:r>
     </w:p>
     <w:p>
@@ -10759,7 +10759,7 @@
             <w:rFonts w:ascii="Cambria Math" w:hAnsi="Cambria Math"/>
             <w:sz w:val="28"/>
           </w:rPr>
-          <m:t xml:space="preserve">Iр(t)=(E/R)*EXP(−t*R/L);   Uр(t)=−E*EXP(−t*R/L)  — формулы Excel</m:t>
+          <m:t xml:space="preserve">Iр(t)=(E/R)*EXP(−t*R/L);   Uр(t)=−E*EXP(−t*R/L)</m:t>
         </m:r>
       </m:oMath>
       <w:r>
@@ -10834,7 +10834,7 @@
         <w:jc w:val="center"/>
       </w:pPr>
       <w:r>
-        <w:t xml:space="preserve">Рис. 6. Зависимость силы тока и напряжения катушки от времени во время разряда (масштаб 10·τр, формулы Excel)</w:t>
+        <w:t xml:space="preserve">Рис. 6. Ток и напряжение при разряде (шкала 10τр)</w:t>
       </w:r>
       <w:r>
         <w:t/>
@@ -10983,7 +10983,7 @@
           <w:rFonts w:ascii="Times New Roman" w:hAnsi="Times New Roman" w:cs="Times New Roman"/>
           <w:sz w:val="28"/>
         </w:rPr>
-        <w:t>Ток и напряжение на катушке изменяются по экспоненциальному закону. Постоянная времени заряда τз = L/r = 9·10^(−4)/9 = 10^(−4) с, разряда τр = L/R = 9·10^(−4)/120 = 7,5·10^(−6) с. Увеличение L замедляет переходный процесс, уменьшение L ускоряет его. Уменьшение r увеличивает установившийся ток E/r и увеличивает τз. Уменьшение R увеличивает начальный ток разряда E/R и увеличивает τр. Графики построены в Excel по формулам Iз, Uз, Iр, Uр и являются диаграммами Excel, а не рисунками.</w:t>
+        <w:t>Ток и напряжение на катушке меняются по экспоненте. При заряде Iз растёт от нуля до E/r, а напряжение на катушке падает от E до 0. Для L = 9·10⁻⁴ Гн и r = 9 Ом постоянная τз = L/r = 10⁻⁴ с, за 0,3–0,5 мс переходный процесс практически заканчивается. Разряд идёт через R = 120 Ом, τр = L/R = 7,5·10⁻⁶ с, то есть заметно быстрее. Если смотреть разряд на том же шаге, что и заряд, кривая сразу уходит в ноль — её имеет смысл строить отдельно, с более мелким шагом. При уменьшении L в три раза ток выходит на E/r раньше. Если уменьшить r, установившийся ток становится больше, а постоянная времени растёт. В целом длительность процесса определяется отношением L к сопротивлению контура.</w:t>
       </w:r>
       <w:r>
         <w:rPr>

</xml_diff>

<commit_message>
Rewrite the lab conclusion in a student voice.
Drop the parallel if-then listing and write what the graphs actually showed, including why discharge needed its own time scale.

Co-authored-by: itkodovaya <itkodovaya@users.noreply.github.com>
</commit_message>
<xml_diff>
--- a/Daniil/задание 1.docx
+++ b/Daniil/задание 1.docx
@@ -9695,7 +9695,21 @@
           <w:sz w:val="24"/>
           <w:szCs w:val="24"/>
         </w:rPr>
-        <w:t xml:space="preserve">Ток и напряжение на катушке меняются по экспоненте. При заряде Iз растёт от нуля до E/r, а напряжение на катушке падает от E до 0. Для L = 9·10⁻⁴ Гн и r = 9 Ом постоянная τз = L/r = 10⁻⁴ с, за 0,3–0,5 мс переходный процесс практически заканчивается. Разряд идёт через R = 120 Ом, τр = L/R = 7,5·10⁻⁶ с, то есть заметно быстрее. Если смотреть разряд на том же шаге, что и заряд, кривая сразу уходит в ноль — её имеет смысл строить отдельно, с более мелким шагом. При уменьшении L в три раза ток выходит на E/r раньше. Если уменьшить r, установившийся ток становится больше, а постоянная времени растёт. В целом длительность процесса определяется отношением L к сопротивлению контура.</w:t>
+        <w:t xml:space="preserve">По графикам заряд и разряд катушки идут по экспоненте, как и выходило из уравнения. Пока ключ на источнике, ток нарастает от нуля до E/r ≈ 0,89 А, а напряжение на L в первый момент равно 8 В и быстро падает. У нас L = 9·10⁻⁴ Гн и r = 9 Ом, τз = 10⁻⁴ с — к половине миллисекунды кривые уже почти горизонтальные, дальше считать почти нечего. Разряд через 120 Ом гораздо короче: τр ≈ 7,5 мкс. С тем же шагом, что заряд, на графике от него ничего не остаётся, поэтому разряд я вынес на отдельную шкалу, примерно 10τр.</w:t>
+      </w:r>
+    </w:p>
+    <w:p>
+      <w:pPr>
+        <w:spacing w:after="160" w:line="276" w:lineRule="auto"/>
+        <w:ind w:firstLine="360"/>
+      </w:pPr>
+      <w:r>
+        <w:rPr>
+          <w:rFonts w:ascii="Times New Roman" w:hAnsi="Times New Roman" w:cs="Times New Roman"/>
+          <w:sz w:val="24"/>
+          <w:szCs w:val="24"/>
+        </w:rPr>
+        <w:t xml:space="preserve">Когда уменьшал L втрое, ток выходил на полку заметно раньше. При r = 4,5 Ом полка выше, около 1,8 А, переход чуть длиннее. С R = 12 Ом разряд тоже растягивается. Постоянная времени тут просто L, делённая на сопротивление того контура, который сейчас замкнут.</w:t>
       </w:r>
     </w:p>
     <w:sectPr>

</xml_diff>

<commit_message>
Put real bold Word equations on the handbook coil circuit.
Keep formulas as OMML (bold italic, not pictures), draw L on the original r1/r2 schematic, and match Excel scatter charts to Iз, Uз, Iр with R+r2.

Co-authored-by: itkodovaya <itkodovaya@users.noreply.github.com>
</commit_message>
<xml_diff>
--- a/Daniil/задание 1.docx
+++ b/Daniil/задание 1.docx
@@ -7929,7 +7929,7 @@
                 <w:b/>
                 <w:sz w:val="22"/>
               </w:rPr>
-              <w:t xml:space="preserve">r, Ом</w:t>
+              <w:t xml:space="preserve">r1, Ом</w:t>
             </w:r>
           </w:p>
         </w:tc>
@@ -8074,9 +8074,115 @@
           </w:p>
         </w:tc>
       </w:tr>
+      <w:tr>
+        <w:tc>
+          <w:tcPr>
+            <w:tcW w:w="2800" w:type="dxa"/>
+            <w:gridSpan w:val="2"/>
+            <w:shd w:val="clear" w:color="auto" w:fill="F2F2F2"/>
+            <w:tcBorders>
+              <w:top w:val="single" w:sz="8" w:space="0" w:color="000000"/>
+              <w:left w:val="single" w:sz="8" w:space="0" w:color="000000"/>
+              <w:bottom w:val="single" w:sz="8" w:space="0" w:color="000000"/>
+              <w:right w:val="single" w:sz="8" w:space="0" w:color="000000"/>
+            </w:tcBorders>
+          </w:tcPr>
+          <w:p>
+            <w:pPr>
+              <w:jc w:val="center"/>
+            </w:pPr>
+            <w:r>
+              <w:rPr>
+                <w:rFonts w:ascii="Times New Roman" w:hAnsi="Times New Roman"/>
+                <w:b/>
+                <w:sz w:val="22"/>
+              </w:rPr>
+              <w:t xml:space="preserve">r2 (лампа Л2)</w:t>
+            </w:r>
+          </w:p>
+        </w:tc>
+        <w:tc>
+          <w:tcPr>
+            <w:tcW w:w="1400" w:type="dxa"/>
+            <w:tcBorders>
+              <w:top w:val="single" w:sz="8" w:space="0" w:color="000000"/>
+              <w:left w:val="single" w:sz="8" w:space="0" w:color="000000"/>
+              <w:bottom w:val="single" w:sz="8" w:space="0" w:color="000000"/>
+              <w:right w:val="single" w:sz="8" w:space="0" w:color="000000"/>
+            </w:tcBorders>
+          </w:tcPr>
+          <w:p>
+            <w:pPr>
+              <w:jc w:val="center"/>
+            </w:pPr>
+            <w:r>
+              <w:rPr>
+                <w:rFonts w:ascii="Times New Roman" w:hAnsi="Times New Roman"/>
+                <w:b/>
+                <w:sz w:val="22"/>
+              </w:rPr>
+              <w:t xml:space="preserve">90</w:t>
+            </w:r>
+          </w:p>
+        </w:tc>
+        <w:tc>
+          <w:tcPr>
+            <w:tcW w:w="1400" w:type="dxa"/>
+            <w:shd w:val="clear" w:color="auto" w:fill="F2F2F2"/>
+            <w:tcBorders>
+              <w:top w:val="single" w:sz="8" w:space="0" w:color="000000"/>
+              <w:left w:val="single" w:sz="8" w:space="0" w:color="000000"/>
+              <w:bottom w:val="single" w:sz="8" w:space="0" w:color="000000"/>
+              <w:right w:val="single" w:sz="8" w:space="0" w:color="000000"/>
+            </w:tcBorders>
+          </w:tcPr>
+          <w:p>
+            <w:pPr>
+              <w:jc w:val="center"/>
+            </w:pPr>
+            <w:r>
+              <w:rPr>
+                <w:rFonts w:ascii="Times New Roman" w:hAnsi="Times New Roman"/>
+                <w:b/>
+                <w:sz w:val="22"/>
+              </w:rPr>
+              <w:t xml:space="preserve">Ом</w:t>
+            </w:r>
+          </w:p>
+        </w:tc>
+        <w:tc>
+          <w:tcPr>
+            <w:tcW w:w="2800" w:type="dxa"/>
+            <w:gridSpan w:val="2"/>
+            <w:tcBorders>
+              <w:top w:val="single" w:sz="8" w:space="0" w:color="000000"/>
+              <w:left w:val="single" w:sz="8" w:space="0" w:color="000000"/>
+              <w:bottom w:val="single" w:sz="8" w:space="0" w:color="000000"/>
+              <w:right w:val="single" w:sz="8" w:space="0" w:color="000000"/>
+            </w:tcBorders>
+          </w:tcPr>
+          <w:p>
+            <w:pPr>
+              <w:jc w:val="center"/>
+            </w:pPr>
+            <w:r>
+              <w:rPr>
+                <w:rFonts w:ascii="Times New Roman" w:hAnsi="Times New Roman"/>
+                <w:sz w:val="22"/>
+              </w:rPr>
+              <w:t xml:space="preserve">r2 = 10·r1, как на схеме</w:t>
+            </w:r>
+          </w:p>
+        </w:tc>
+      </w:tr>
     </w:tbl>
     <w:p>
       <w:pPr>
+        <w:rPr>
+          <w:b/>
+          <w:bCs/>
+          <w:i/>
+        </w:rPr>
         <w:jc w:val="center"/>
         <w:spacing w:after="120" w:line="276" w:lineRule="auto"/>
       </w:pPr>
@@ -8087,16 +8193,18 @@
         <m:oMath>
           <m:r>
             <m:rPr>
-              <m:sty m:val="b"/>
+              <m:sty m:val="bi"/>
             </m:rPr>
             <w:rPr>
               <w:rFonts w:ascii="Cambria Math" w:hAnsi="Cambria Math"/>
               <w:b/>
               <w:bCs/>
-              <w:sz w:val="28"/>
-              <w:szCs w:val="28"/>
+              <w:i/>
+              <w:iCs/>
+              <w:sz w:val="32"/>
+              <w:szCs w:val="32"/>
             </w:rPr>
-            <m:t xml:space="preserve">E = 8 В;   L = 9·10⁻⁴ Гн;   R = 120 Ом;   r = 9 Ом;   t0 = 0 с;   I(t0) = 0 А.</m:t>
+            <m:t xml:space="preserve">E = 8 В;   L = 9·10⁻⁴ Гн;   R = 120 Ом;   r1 = 9 Ом;   r2 = 90 Ом;   t0 = 0 с;   I(t0) = 0 А.</m:t>
           </m:r>
         </m:oMath>
       </m:oMathPara>
@@ -8128,7 +8236,7 @@
           <w:sz w:val="24"/>
           <w:szCs w:val="24"/>
         </w:rPr>
-        <w:t xml:space="preserve">Верхний переключатель в левом положении: источник E подключён к катушке L через сопротивление r. Ток в катушке растёт от нуля, напряжение на катушке в начальный момент равно E.</w:t>
+        <w:t xml:space="preserve">Верхний переключатель в левом положении: источник E подключён к катушке L через лампу Л1 (r1). Ток в катушке растёт от нуля, напряжение на катушке в начальный момент равно E.</w:t>
       </w:r>
     </w:p>
     <w:p>
@@ -8224,6 +8332,11 @@
     </w:p>
     <w:p>
       <w:pPr>
+        <w:rPr>
+          <w:b/>
+          <w:bCs/>
+          <w:i/>
+        </w:rPr>
         <w:jc w:val="center"/>
         <w:spacing w:after="120" w:line="276" w:lineRule="auto"/>
       </w:pPr>
@@ -8234,22 +8347,29 @@
         <m:oMath>
           <m:r>
             <m:rPr>
-              <m:sty m:val="b"/>
+              <m:sty m:val="bi"/>
             </m:rPr>
             <w:rPr>
               <w:rFonts w:ascii="Cambria Math" w:hAnsi="Cambria Math"/>
               <w:b/>
               <w:bCs/>
-              <w:sz w:val="28"/>
-              <w:szCs w:val="28"/>
+              <w:i/>
+              <w:iCs/>
+              <w:sz w:val="32"/>
+              <w:szCs w:val="32"/>
             </w:rPr>
-            <m:t xml:space="preserve">E = i·r + u_L     (второй закон Кирхгофа)</m:t>
+            <m:t xml:space="preserve">E = Uл1 + UL     (второй закон Кирхгофа)</m:t>
           </m:r>
         </m:oMath>
       </m:oMathPara>
     </w:p>
     <w:p>
       <w:pPr>
+        <w:rPr>
+          <w:b/>
+          <w:bCs/>
+          <w:i/>
+        </w:rPr>
         <w:jc w:val="center"/>
         <w:spacing w:after="120" w:line="276" w:lineRule="auto"/>
       </w:pPr>
@@ -8260,22 +8380,29 @@
         <m:oMath>
           <m:r>
             <m:rPr>
-              <m:sty m:val="b"/>
+              <m:sty m:val="bi"/>
             </m:rPr>
             <w:rPr>
               <w:rFonts w:ascii="Cambria Math" w:hAnsi="Cambria Math"/>
               <w:b/>
               <w:bCs/>
-              <w:sz w:val="28"/>
-              <w:szCs w:val="28"/>
+              <w:i/>
+              <w:iCs/>
+              <w:sz w:val="32"/>
+              <w:szCs w:val="32"/>
             </w:rPr>
-            <m:t xml:space="preserve">u_L = L · di/dt     (закон электромагнитной индукции)</m:t>
+            <m:t xml:space="preserve">Uл1 = I·r1     (закон Ома)</m:t>
           </m:r>
         </m:oMath>
       </m:oMathPara>
     </w:p>
     <w:p>
       <w:pPr>
+        <w:rPr>
+          <w:b/>
+          <w:bCs/>
+          <w:i/>
+        </w:rPr>
         <w:jc w:val="center"/>
         <w:spacing w:after="120" w:line="276" w:lineRule="auto"/>
       </w:pPr>
@@ -8286,16 +8413,18 @@
         <m:oMath>
           <m:r>
             <m:rPr>
-              <m:sty m:val="b"/>
+              <m:sty m:val="bi"/>
             </m:rPr>
             <w:rPr>
               <w:rFonts w:ascii="Cambria Math" w:hAnsi="Cambria Math"/>
               <w:b/>
               <w:bCs/>
-              <w:sz w:val="28"/>
-              <w:szCs w:val="28"/>
+              <w:i/>
+              <w:iCs/>
+              <w:sz w:val="32"/>
+              <w:szCs w:val="32"/>
             </w:rPr>
-            <m:t xml:space="preserve">u_r = i·r     (закон Ома)</m:t>
+            <m:t xml:space="preserve">UL = L·I'     (закон электромагнитной индукции)</m:t>
           </m:r>
         </m:oMath>
       </m:oMathPara>
@@ -8318,6 +8447,11 @@
     </w:p>
     <w:p>
       <w:pPr>
+        <w:rPr>
+          <w:b/>
+          <w:bCs/>
+          <w:i/>
+        </w:rPr>
         <w:jc w:val="center"/>
         <w:spacing w:after="120" w:line="276" w:lineRule="auto"/>
       </w:pPr>
@@ -8328,22 +8462,29 @@
         <m:oMath>
           <m:r>
             <m:rPr>
-              <m:sty m:val="b"/>
+              <m:sty m:val="bi"/>
             </m:rPr>
             <w:rPr>
               <w:rFonts w:ascii="Cambria Math" w:hAnsi="Cambria Math"/>
               <w:b/>
               <w:bCs/>
-              <w:sz w:val="28"/>
-              <w:szCs w:val="28"/>
+              <w:i/>
+              <w:iCs/>
+              <w:sz w:val="32"/>
+              <w:szCs w:val="32"/>
             </w:rPr>
-            <m:t xml:space="preserve">E = i·r + L·di/dt</m:t>
+            <m:t xml:space="preserve">E = I·r1 + L·di/dt</m:t>
           </m:r>
         </m:oMath>
       </m:oMathPara>
     </w:p>
     <w:p>
       <w:pPr>
+        <w:rPr>
+          <w:b/>
+          <w:bCs/>
+          <w:i/>
+        </w:rPr>
         <w:jc w:val="center"/>
         <w:spacing w:after="120" w:line="276" w:lineRule="auto"/>
       </w:pPr>
@@ -8354,22 +8495,29 @@
         <m:oMath>
           <m:r>
             <m:rPr>
-              <m:sty m:val="b"/>
+              <m:sty m:val="bi"/>
             </m:rPr>
             <w:rPr>
               <w:rFonts w:ascii="Cambria Math" w:hAnsi="Cambria Math"/>
               <w:b/>
               <w:bCs/>
-              <w:sz w:val="28"/>
-              <w:szCs w:val="28"/>
+              <w:i/>
+              <w:iCs/>
+              <w:sz w:val="32"/>
+              <w:szCs w:val="32"/>
             </w:rPr>
-            <m:t xml:space="preserve">L·di/dt + r·i = E</m:t>
+            <m:t xml:space="preserve">L·di/dt + r1·I = E</m:t>
           </m:r>
         </m:oMath>
       </m:oMathPara>
     </w:p>
     <w:p>
       <w:pPr>
+        <w:rPr>
+          <w:b/>
+          <w:bCs/>
+          <w:i/>
+        </w:rPr>
         <w:jc w:val="center"/>
         <w:spacing w:after="120" w:line="276" w:lineRule="auto"/>
       </w:pPr>
@@ -8380,22 +8528,29 @@
         <m:oMath>
           <m:r>
             <m:rPr>
-              <m:sty m:val="b"/>
+              <m:sty m:val="bi"/>
             </m:rPr>
             <w:rPr>
               <w:rFonts w:ascii="Cambria Math" w:hAnsi="Cambria Math"/>
               <w:b/>
               <w:bCs/>
-              <w:sz w:val="28"/>
-              <w:szCs w:val="28"/>
+              <w:i/>
+              <w:iCs/>
+              <w:sz w:val="32"/>
+              <w:szCs w:val="32"/>
             </w:rPr>
-            <m:t xml:space="preserve">di/dt + (r/L)·i = E/L</m:t>
+            <m:t xml:space="preserve">di/dt + (r1/L)·I = E/L</m:t>
           </m:r>
         </m:oMath>
       </m:oMathPara>
     </w:p>
     <w:p>
       <w:pPr>
+        <w:rPr>
+          <w:b/>
+          <w:bCs/>
+          <w:i/>
+        </w:rPr>
         <w:jc w:val="center"/>
         <w:spacing w:after="120" w:line="276" w:lineRule="auto"/>
       </w:pPr>
@@ -8406,16 +8561,18 @@
         <m:oMath>
           <m:r>
             <m:rPr>
-              <m:sty m:val="b"/>
+              <m:sty m:val="bi"/>
             </m:rPr>
             <w:rPr>
               <w:rFonts w:ascii="Cambria Math" w:hAnsi="Cambria Math"/>
               <w:b/>
               <w:bCs/>
-              <w:sz w:val="28"/>
-              <w:szCs w:val="28"/>
+              <w:i/>
+              <w:iCs/>
+              <w:sz w:val="32"/>
+              <w:szCs w:val="32"/>
             </w:rPr>
-            <m:t xml:space="preserve">di/dt = (E − i·r)/L</m:t>
+            <m:t xml:space="preserve">di/dt = (E − I·r1)/L</m:t>
           </m:r>
         </m:oMath>
       </m:oMathPara>
@@ -8438,6 +8595,11 @@
     </w:p>
     <w:p>
       <w:pPr>
+        <w:rPr>
+          <w:b/>
+          <w:bCs/>
+          <w:i/>
+        </w:rPr>
         <w:jc w:val="center"/>
         <w:spacing w:after="120" w:line="276" w:lineRule="auto"/>
       </w:pPr>
@@ -8448,16 +8610,18 @@
         <m:oMath>
           <m:r>
             <m:rPr>
-              <m:sty m:val="b"/>
+              <m:sty m:val="bi"/>
             </m:rPr>
             <w:rPr>
               <w:rFonts w:ascii="Cambria Math" w:hAnsi="Cambria Math"/>
               <w:b/>
               <w:bCs/>
-              <w:sz w:val="28"/>
-              <w:szCs w:val="28"/>
+              <w:i/>
+              <w:iCs/>
+              <w:sz w:val="32"/>
+              <w:szCs w:val="32"/>
             </w:rPr>
-            <m:t xml:space="preserve">di/dt = (E − i·r)/L</m:t>
+            <m:t xml:space="preserve">di/dt = (E − I·r1)/L</m:t>
           </m:r>
         </m:oMath>
       </m:oMathPara>
@@ -8480,6 +8644,11 @@
     </w:p>
     <w:p>
       <w:pPr>
+        <w:rPr>
+          <w:b/>
+          <w:bCs/>
+          <w:i/>
+        </w:rPr>
         <w:jc w:val="center"/>
         <w:spacing w:after="120" w:line="276" w:lineRule="auto"/>
       </w:pPr>
@@ -8490,14 +8659,16 @@
         <m:oMath>
           <m:r>
             <m:rPr>
-              <m:sty m:val="b"/>
+              <m:sty m:val="bi"/>
             </m:rPr>
             <w:rPr>
               <w:rFonts w:ascii="Cambria Math" w:hAnsi="Cambria Math"/>
               <w:b/>
               <w:bCs/>
-              <w:sz w:val="28"/>
-              <w:szCs w:val="28"/>
+              <w:i/>
+              <w:iCs/>
+              <w:sz w:val="32"/>
+              <w:szCs w:val="32"/>
             </w:rPr>
             <m:t xml:space="preserve">I(0) = 0,    t0 = 0</m:t>
           </m:r>
@@ -8522,6 +8693,11 @@
     </w:p>
     <w:p>
       <w:pPr>
+        <w:rPr>
+          <w:b/>
+          <w:bCs/>
+          <w:i/>
+        </w:rPr>
         <w:jc w:val="center"/>
         <w:spacing w:after="120" w:line="276" w:lineRule="auto"/>
       </w:pPr>
@@ -8532,22 +8708,29 @@
         <m:oMath>
           <m:r>
             <m:rPr>
-              <m:sty m:val="b"/>
+              <m:sty m:val="bi"/>
             </m:rPr>
             <w:rPr>
               <w:rFonts w:ascii="Cambria Math" w:hAnsi="Cambria Math"/>
               <w:b/>
               <w:bCs/>
-              <w:sz w:val="28"/>
-              <w:szCs w:val="28"/>
+              <w:i/>
+              <w:iCs/>
+              <w:sz w:val="32"/>
+              <w:szCs w:val="32"/>
             </w:rPr>
-            <m:t xml:space="preserve">di / (i − E/r) = − (r/L) dt</m:t>
+            <m:t xml:space="preserve">di / (I − E/r1) = − (r1/L) dt</m:t>
           </m:r>
         </m:oMath>
       </m:oMathPara>
     </w:p>
     <w:p>
       <w:pPr>
+        <w:rPr>
+          <w:b/>
+          <w:bCs/>
+          <w:i/>
+        </w:rPr>
         <w:jc w:val="center"/>
         <w:spacing w:after="120" w:line="276" w:lineRule="auto"/>
       </w:pPr>
@@ -8558,14 +8741,16 @@
         <m:oMath>
           <m:r>
             <m:rPr>
-              <m:sty m:val="b"/>
+              <m:sty m:val="bi"/>
             </m:rPr>
             <w:rPr>
               <w:rFonts w:ascii="Cambria Math" w:hAnsi="Cambria Math"/>
               <w:b/>
               <w:bCs/>
-              <w:sz w:val="28"/>
-              <w:szCs w:val="28"/>
+              <w:i/>
+              <w:iCs/>
+              <w:sz w:val="32"/>
+              <w:szCs w:val="32"/>
             </w:rPr>
             <m:t xml:space="preserve">ln</m:t>
           </m:r>
@@ -8577,37 +8762,46 @@
             <m:e>
               <m:r>
                 <m:rPr>
-                  <m:sty m:val="b"/>
+                  <m:sty m:val="bi"/>
                 </m:rPr>
                 <w:rPr>
                   <w:rFonts w:ascii="Cambria Math" w:hAnsi="Cambria Math"/>
                   <w:b/>
                   <w:bCs/>
-                  <w:sz w:val="28"/>
-                  <w:szCs w:val="28"/>
+                  <w:i/>
+                  <w:iCs/>
+                  <w:sz w:val="32"/>
+                  <w:szCs w:val="32"/>
                 </w:rPr>
-                <m:t xml:space="preserve">i − E/r</m:t>
+                <m:t xml:space="preserve">I − E/r1</m:t>
               </m:r>
             </m:e>
           </m:d>
           <m:r>
             <m:rPr>
-              <m:sty m:val="b"/>
+              <m:sty m:val="bi"/>
             </m:rPr>
             <w:rPr>
               <w:rFonts w:ascii="Cambria Math" w:hAnsi="Cambria Math"/>
               <w:b/>
               <w:bCs/>
-              <w:sz w:val="28"/>
-              <w:szCs w:val="28"/>
+              <w:i/>
+              <w:iCs/>
+              <w:sz w:val="32"/>
+              <w:szCs w:val="32"/>
             </w:rPr>
-            <m:t xml:space="preserve"> = − (r/L)·t + C1</m:t>
+            <m:t xml:space="preserve"> = − (r1/L)·t + C1</m:t>
           </m:r>
         </m:oMath>
       </m:oMathPara>
     </w:p>
     <w:p>
       <w:pPr>
+        <w:rPr>
+          <w:b/>
+          <w:bCs/>
+          <w:i/>
+        </w:rPr>
         <w:jc w:val="center"/>
         <w:spacing w:after="120" w:line="276" w:lineRule="auto"/>
       </w:pPr>
@@ -8618,22 +8812,29 @@
         <m:oMath>
           <m:r>
             <m:rPr>
-              <m:sty m:val="b"/>
+              <m:sty m:val="bi"/>
             </m:rPr>
             <w:rPr>
               <w:rFonts w:ascii="Cambria Math" w:hAnsi="Cambria Math"/>
               <w:b/>
               <w:bCs/>
-              <w:sz w:val="28"/>
-              <w:szCs w:val="28"/>
+              <w:i/>
+              <w:iCs/>
+              <w:sz w:val="32"/>
+              <w:szCs w:val="32"/>
             </w:rPr>
-            <m:t xml:space="preserve">i − E/r = C2 · exp(−t·r/L)</m:t>
+            <m:t xml:space="preserve">I − E/r1 = C2 · exp(−t·r1/L)</m:t>
           </m:r>
         </m:oMath>
       </m:oMathPara>
     </w:p>
     <w:p>
       <w:pPr>
+        <w:rPr>
+          <w:b/>
+          <w:bCs/>
+          <w:i/>
+        </w:rPr>
         <w:jc w:val="center"/>
         <w:spacing w:after="120" w:line="276" w:lineRule="auto"/>
       </w:pPr>
@@ -8644,16 +8845,18 @@
         <m:oMath>
           <m:r>
             <m:rPr>
-              <m:sty m:val="b"/>
+              <m:sty m:val="bi"/>
             </m:rPr>
             <w:rPr>
               <w:rFonts w:ascii="Cambria Math" w:hAnsi="Cambria Math"/>
               <w:b/>
               <w:bCs/>
-              <w:sz w:val="28"/>
-              <w:szCs w:val="28"/>
+              <w:i/>
+              <w:iCs/>
+              <w:sz w:val="32"/>
+              <w:szCs w:val="32"/>
             </w:rPr>
-            <m:t xml:space="preserve">I(0) = 0  ⇒  C2 = − E/r</m:t>
+            <m:t xml:space="preserve">I(0) = 0  ⇒  C2 = − E/r1</m:t>
           </m:r>
         </m:oMath>
       </m:oMathPara>
@@ -8676,6 +8879,11 @@
     </w:p>
     <w:p>
       <w:pPr>
+        <w:rPr>
+          <w:b/>
+          <w:bCs/>
+          <w:i/>
+        </w:rPr>
         <w:jc w:val="center"/>
         <w:spacing w:after="120" w:line="276" w:lineRule="auto"/>
       </w:pPr>
@@ -8686,22 +8894,29 @@
         <m:oMath>
           <m:r>
             <m:rPr>
-              <m:sty m:val="b"/>
+              <m:sty m:val="bi"/>
             </m:rPr>
             <w:rPr>
               <w:rFonts w:ascii="Cambria Math" w:hAnsi="Cambria Math"/>
               <w:b/>
               <w:bCs/>
-              <w:sz w:val="28"/>
-              <w:szCs w:val="28"/>
+              <w:i/>
+              <w:iCs/>
+              <w:sz w:val="32"/>
+              <w:szCs w:val="32"/>
             </w:rPr>
-            <m:t xml:space="preserve">Iз(t) = (E/r)·(1 − exp(−t·r/L))</m:t>
+            <m:t xml:space="preserve">Iз(t) = (E/r1)·(1 − exp(−t·r1/L))</m:t>
           </m:r>
         </m:oMath>
       </m:oMathPara>
     </w:p>
     <w:p>
       <w:pPr>
+        <w:rPr>
+          <w:b/>
+          <w:bCs/>
+          <w:i/>
+        </w:rPr>
         <w:jc w:val="center"/>
         <w:spacing w:after="120" w:line="276" w:lineRule="auto"/>
       </w:pPr>
@@ -8712,22 +8927,29 @@
         <m:oMath>
           <m:r>
             <m:rPr>
-              <m:sty m:val="b"/>
+              <m:sty m:val="bi"/>
             </m:rPr>
             <w:rPr>
               <w:rFonts w:ascii="Cambria Math" w:hAnsi="Cambria Math"/>
               <w:b/>
               <w:bCs/>
-              <w:sz w:val="28"/>
-              <w:szCs w:val="28"/>
+              <w:i/>
+              <w:iCs/>
+              <w:sz w:val="32"/>
+              <w:szCs w:val="32"/>
             </w:rPr>
-            <m:t xml:space="preserve">Uз(t) = E · exp(−t·r/L)</m:t>
+            <m:t xml:space="preserve">Uз(t) = E · exp(−t·r1/L)</m:t>
           </m:r>
         </m:oMath>
       </m:oMathPara>
     </w:p>
     <w:p>
       <w:pPr>
+        <w:rPr>
+          <w:b/>
+          <w:bCs/>
+          <w:i/>
+        </w:rPr>
         <w:jc w:val="center"/>
         <w:spacing w:after="120" w:line="276" w:lineRule="auto"/>
       </w:pPr>
@@ -8738,16 +8960,18 @@
         <m:oMath>
           <m:r>
             <m:rPr>
-              <m:sty m:val="b"/>
+              <m:sty m:val="bi"/>
             </m:rPr>
             <w:rPr>
               <w:rFonts w:ascii="Cambria Math" w:hAnsi="Cambria Math"/>
               <w:b/>
               <w:bCs/>
-              <w:sz w:val="28"/>
-              <w:szCs w:val="28"/>
+              <w:i/>
+              <w:iCs/>
+              <w:sz w:val="32"/>
+              <w:szCs w:val="32"/>
             </w:rPr>
-            <m:t xml:space="preserve">Excel:  Iз=(E/r)*(1-EXP(-t*r/L));   Uз=E*EXP(-t*r/L)</m:t>
+            <m:t xml:space="preserve">Excel:  Iз=(E/r1)*(1-EXP(-t*r1/L));   Uз=E*EXP(-t*r1/L)</m:t>
           </m:r>
         </m:oMath>
       </m:oMathPara>
@@ -8845,6 +9069,11 @@
     </w:p>
     <w:p>
       <w:pPr>
+        <w:rPr>
+          <w:b/>
+          <w:bCs/>
+          <w:i/>
+        </w:rPr>
         <w:jc w:val="center"/>
         <w:spacing w:after="120" w:line="276" w:lineRule="auto"/>
       </w:pPr>
@@ -8855,16 +9084,18 @@
         <m:oMath>
           <m:r>
             <m:rPr>
-              <m:sty m:val="b"/>
+              <m:sty m:val="bi"/>
             </m:rPr>
             <w:rPr>
               <w:rFonts w:ascii="Cambria Math" w:hAnsi="Cambria Math"/>
               <w:b/>
               <w:bCs/>
-              <w:sz w:val="28"/>
-              <w:szCs w:val="28"/>
+              <w:i/>
+              <w:iCs/>
+              <w:sz w:val="32"/>
+              <w:szCs w:val="32"/>
             </w:rPr>
-            <m:t xml:space="preserve">L = 3·10⁻⁴ Гн,   r = 9 Ом</m:t>
+            <m:t xml:space="preserve">L = 3·10⁻⁴ Гн,   r1 = 9 Ом</m:t>
           </m:r>
         </m:oMath>
       </m:oMathPara>
@@ -8880,7 +9111,7 @@
           <w:sz w:val="24"/>
           <w:szCs w:val="24"/>
         </w:rPr>
-        <w:t xml:space="preserve">Постоянная времени меньше, ток выходит на E/r быстрее.</w:t>
+        <w:t xml:space="preserve">Постоянная времени меньше, ток выходит на E/r1 быстрее.</w:t>
       </w:r>
     </w:p>
     <w:p>
@@ -8963,11 +9194,16 @@
           <w:sz w:val="26"/>
           <w:szCs w:val="26"/>
         </w:rPr>
-        <w:t xml:space="preserve">Этап 1.2. Заряд при уменьшении r в 2 раза</w:t>
-      </w:r>
-    </w:p>
-    <w:p>
-      <w:pPr>
+        <w:t xml:space="preserve">Этап 1.2. Заряд при уменьшении r1 в 2 раза</w:t>
+      </w:r>
+    </w:p>
+    <w:p>
+      <w:pPr>
+        <w:rPr>
+          <w:b/>
+          <w:bCs/>
+          <w:i/>
+        </w:rPr>
         <w:jc w:val="center"/>
         <w:spacing w:after="120" w:line="276" w:lineRule="auto"/>
       </w:pPr>
@@ -8978,16 +9214,18 @@
         <m:oMath>
           <m:r>
             <m:rPr>
-              <m:sty m:val="b"/>
+              <m:sty m:val="bi"/>
             </m:rPr>
             <w:rPr>
               <w:rFonts w:ascii="Cambria Math" w:hAnsi="Cambria Math"/>
               <w:b/>
               <w:bCs/>
-              <w:sz w:val="28"/>
-              <w:szCs w:val="28"/>
+              <w:i/>
+              <w:iCs/>
+              <w:sz w:val="32"/>
+              <w:szCs w:val="32"/>
             </w:rPr>
-            <m:t xml:space="preserve">L = 9·10⁻⁴ Гн;   r = 4,5 Ом</m:t>
+            <m:t xml:space="preserve">L = 9·10⁻⁴ Гн;   r1 = 4,5 Ом</m:t>
           </m:r>
         </m:oMath>
       </m:oMathPara>
@@ -9003,7 +9241,7 @@
           <w:sz w:val="24"/>
           <w:szCs w:val="24"/>
         </w:rPr>
-        <w:t xml:space="preserve">Установившийся ток E/r больше, постоянная времени τз = L/r больше.</w:t>
+        <w:t xml:space="preserve">Установившийся ток E/r1 больше, постоянная времени τз = L/r1 больше.</w:t>
       </w:r>
     </w:p>
     <w:p>
@@ -9065,7 +9303,7 @@
           <w:sz w:val="22"/>
           <w:szCs w:val="22"/>
         </w:rPr>
-        <w:t xml:space="preserve">Рис. 4. Заряд катушки при r = 4,5 Ом</w:t>
+        <w:t xml:space="preserve">Рис. 4. Заряд катушки при r1 = 4,5 Ом</w:t>
       </w:r>
     </w:p>
     <w:p>
@@ -9095,7 +9333,7 @@
           <w:sz w:val="24"/>
           <w:szCs w:val="24"/>
         </w:rPr>
-        <w:t xml:space="preserve">Верхний переключатель в правом положении: контур L–R, источник отключён. Начальный ток разряда принят равным E/R.</w:t>
+        <w:t xml:space="preserve">Верхний переключатель в правом положении: контур L — Л2 (r2) — R, источник отключён. Ток катушки не может скакнуть, поэтому Iр(0) = E/r1.</w:t>
       </w:r>
     </w:p>
     <w:p>
@@ -9191,6 +9429,11 @@
     </w:p>
     <w:p>
       <w:pPr>
+        <w:rPr>
+          <w:b/>
+          <w:bCs/>
+          <w:i/>
+        </w:rPr>
         <w:jc w:val="center"/>
         <w:spacing w:after="120" w:line="276" w:lineRule="auto"/>
       </w:pPr>
@@ -9201,22 +9444,29 @@
         <m:oMath>
           <m:r>
             <m:rPr>
-              <m:sty m:val="b"/>
+              <m:sty m:val="bi"/>
             </m:rPr>
             <w:rPr>
               <w:rFonts w:ascii="Cambria Math" w:hAnsi="Cambria Math"/>
               <w:b/>
               <w:bCs/>
-              <w:sz w:val="28"/>
-              <w:szCs w:val="28"/>
+              <w:i/>
+              <w:iCs/>
+              <w:sz w:val="32"/>
+              <w:szCs w:val="32"/>
             </w:rPr>
-            <m:t xml:space="preserve">0 = i·R + u_L     (второй закон Кирхгофа)</m:t>
+            <m:t xml:space="preserve">UL + UR + Uл2 = 0     (второй закон Кирхгофа)</m:t>
           </m:r>
         </m:oMath>
       </m:oMathPara>
     </w:p>
     <w:p>
       <w:pPr>
+        <w:rPr>
+          <w:b/>
+          <w:bCs/>
+          <w:i/>
+        </w:rPr>
         <w:jc w:val="center"/>
         <w:spacing w:after="120" w:line="276" w:lineRule="auto"/>
       </w:pPr>
@@ -9227,38 +9477,29 @@
         <m:oMath>
           <m:r>
             <m:rPr>
-              <m:sty m:val="b"/>
+              <m:sty m:val="bi"/>
             </m:rPr>
             <w:rPr>
               <w:rFonts w:ascii="Cambria Math" w:hAnsi="Cambria Math"/>
               <w:b/>
               <w:bCs/>
-              <w:sz w:val="28"/>
-              <w:szCs w:val="28"/>
+              <w:i/>
+              <w:iCs/>
+              <w:sz w:val="32"/>
+              <w:szCs w:val="32"/>
             </w:rPr>
-            <m:t xml:space="preserve">u_L = L·di/dt,    u_R = i·R</m:t>
+            <m:t xml:space="preserve">Uл2 = I·r2     (закон Ома)</m:t>
           </m:r>
         </m:oMath>
       </m:oMathPara>
     </w:p>
     <w:p>
       <w:pPr>
-        <w:spacing w:after="160" w:line="276" w:lineRule="auto"/>
-        <w:ind w:firstLine="0"/>
-      </w:pPr>
-      <w:r>
-        <w:rPr>
-          <w:rFonts w:ascii="Times New Roman" w:hAnsi="Times New Roman" w:cs="Times New Roman"/>
+        <w:rPr>
           <w:b/>
           <w:bCs/>
-          <w:sz w:val="26"/>
-          <w:szCs w:val="26"/>
-        </w:rPr>
-        <w:t xml:space="preserve">Преобразования</w:t>
-      </w:r>
-    </w:p>
-    <w:p>
-      <w:pPr>
+          <w:i/>
+        </w:rPr>
         <w:jc w:val="center"/>
         <w:spacing w:after="120" w:line="276" w:lineRule="auto"/>
       </w:pPr>
@@ -9269,22 +9510,29 @@
         <m:oMath>
           <m:r>
             <m:rPr>
-              <m:sty m:val="b"/>
+              <m:sty m:val="bi"/>
             </m:rPr>
             <w:rPr>
               <w:rFonts w:ascii="Cambria Math" w:hAnsi="Cambria Math"/>
               <w:b/>
               <w:bCs/>
-              <w:sz w:val="28"/>
-              <w:szCs w:val="28"/>
+              <w:i/>
+              <w:iCs/>
+              <w:sz w:val="32"/>
+              <w:szCs w:val="32"/>
             </w:rPr>
-            <m:t xml:space="preserve">L·di/dt + R·i = 0</m:t>
+            <m:t xml:space="preserve">UR = I·R     (закон Ома)</m:t>
           </m:r>
         </m:oMath>
       </m:oMathPara>
     </w:p>
     <w:p>
       <w:pPr>
+        <w:rPr>
+          <w:b/>
+          <w:bCs/>
+          <w:i/>
+        </w:rPr>
         <w:jc w:val="center"/>
         <w:spacing w:after="120" w:line="276" w:lineRule="auto"/>
       </w:pPr>
@@ -9295,22 +9543,45 @@
         <m:oMath>
           <m:r>
             <m:rPr>
-              <m:sty m:val="b"/>
+              <m:sty m:val="bi"/>
             </m:rPr>
             <w:rPr>
               <w:rFonts w:ascii="Cambria Math" w:hAnsi="Cambria Math"/>
               <w:b/>
               <w:bCs/>
-              <w:sz w:val="28"/>
-              <w:szCs w:val="28"/>
+              <w:i/>
+              <w:iCs/>
+              <w:sz w:val="32"/>
+              <w:szCs w:val="32"/>
             </w:rPr>
-            <m:t xml:space="preserve">di/dt + (R/L)·i = 0</m:t>
+            <m:t xml:space="preserve">UL = L·I'     (закон электромагнитной индукции)</m:t>
           </m:r>
         </m:oMath>
       </m:oMathPara>
     </w:p>
     <w:p>
       <w:pPr>
+        <w:spacing w:after="160" w:line="276" w:lineRule="auto"/>
+        <w:ind w:firstLine="0"/>
+      </w:pPr>
+      <w:r>
+        <w:rPr>
+          <w:rFonts w:ascii="Times New Roman" w:hAnsi="Times New Roman" w:cs="Times New Roman"/>
+          <w:b/>
+          <w:bCs/>
+          <w:sz w:val="26"/>
+          <w:szCs w:val="26"/>
+        </w:rPr>
+        <w:t xml:space="preserve">Преобразования</w:t>
+      </w:r>
+    </w:p>
+    <w:p>
+      <w:pPr>
+        <w:rPr>
+          <w:b/>
+          <w:bCs/>
+          <w:i/>
+        </w:rPr>
         <w:jc w:val="center"/>
         <w:spacing w:after="120" w:line="276" w:lineRule="auto"/>
       </w:pPr>
@@ -9321,38 +9592,29 @@
         <m:oMath>
           <m:r>
             <m:rPr>
-              <m:sty m:val="b"/>
+              <m:sty m:val="bi"/>
             </m:rPr>
             <w:rPr>
               <w:rFonts w:ascii="Cambria Math" w:hAnsi="Cambria Math"/>
               <w:b/>
               <w:bCs/>
-              <w:sz w:val="28"/>
-              <w:szCs w:val="28"/>
+              <w:i/>
+              <w:iCs/>
+              <w:sz w:val="32"/>
+              <w:szCs w:val="32"/>
             </w:rPr>
-            <m:t xml:space="preserve">di/dt = − (R/L)·i</m:t>
+            <m:t xml:space="preserve">L·di/dt + I·R + I·r2 = 0</m:t>
           </m:r>
         </m:oMath>
       </m:oMathPara>
     </w:p>
     <w:p>
       <w:pPr>
-        <w:spacing w:after="160" w:line="276" w:lineRule="auto"/>
-        <w:ind w:firstLine="0"/>
-      </w:pPr>
-      <w:r>
-        <w:rPr>
-          <w:rFonts w:ascii="Times New Roman" w:hAnsi="Times New Roman" w:cs="Times New Roman"/>
+        <w:rPr>
           <w:b/>
           <w:bCs/>
-          <w:sz w:val="26"/>
-          <w:szCs w:val="26"/>
-        </w:rPr>
-        <w:t xml:space="preserve">Сформулирована задача Коши</w:t>
-      </w:r>
-    </w:p>
-    <w:p>
-      <w:pPr>
+          <w:i/>
+        </w:rPr>
         <w:jc w:val="center"/>
         <w:spacing w:after="120" w:line="276" w:lineRule="auto"/>
       </w:pPr>
@@ -9363,38 +9625,29 @@
         <m:oMath>
           <m:r>
             <m:rPr>
-              <m:sty m:val="b"/>
+              <m:sty m:val="bi"/>
             </m:rPr>
             <w:rPr>
               <w:rFonts w:ascii="Cambria Math" w:hAnsi="Cambria Math"/>
               <w:b/>
               <w:bCs/>
-              <w:sz w:val="28"/>
-              <w:szCs w:val="28"/>
+              <w:i/>
+              <w:iCs/>
+              <w:sz w:val="32"/>
+              <w:szCs w:val="32"/>
             </w:rPr>
-            <m:t xml:space="preserve">di/dt = − (R/L)·i</m:t>
+            <m:t xml:space="preserve">di/dt + ((R+r2)/L)·I = 0</m:t>
           </m:r>
         </m:oMath>
       </m:oMathPara>
     </w:p>
     <w:p>
       <w:pPr>
-        <w:spacing w:after="160" w:line="276" w:lineRule="auto"/>
-        <w:ind w:firstLine="0"/>
-      </w:pPr>
-      <w:r>
-        <w:rPr>
-          <w:rFonts w:ascii="Times New Roman" w:hAnsi="Times New Roman" w:cs="Times New Roman"/>
+        <w:rPr>
           <w:b/>
           <w:bCs/>
-          <w:sz w:val="26"/>
-          <w:szCs w:val="26"/>
-        </w:rPr>
-        <w:t xml:space="preserve">Начальные условия</w:t>
-      </w:r>
-    </w:p>
-    <w:p>
-      <w:pPr>
+          <w:i/>
+        </w:rPr>
         <w:jc w:val="center"/>
         <w:spacing w:after="120" w:line="276" w:lineRule="auto"/>
       </w:pPr>
@@ -9405,16 +9658,18 @@
         <m:oMath>
           <m:r>
             <m:rPr>
-              <m:sty m:val="b"/>
+              <m:sty m:val="bi"/>
             </m:rPr>
             <w:rPr>
               <w:rFonts w:ascii="Cambria Math" w:hAnsi="Cambria Math"/>
               <w:b/>
               <w:bCs/>
-              <w:sz w:val="28"/>
-              <w:szCs w:val="28"/>
+              <w:i/>
+              <w:iCs/>
+              <w:sz w:val="32"/>
+              <w:szCs w:val="32"/>
             </w:rPr>
-            <m:t xml:space="preserve">Iр(0) = E/R,    t0 = 0</m:t>
+            <m:t xml:space="preserve">di/dt = − (R+r2)/L · I</m:t>
           </m:r>
         </m:oMath>
       </m:oMathPara>
@@ -9432,11 +9687,16 @@
           <w:sz w:val="26"/>
           <w:szCs w:val="26"/>
         </w:rPr>
-        <w:t xml:space="preserve">Решение уравнения</w:t>
-      </w:r>
-    </w:p>
-    <w:p>
-      <w:pPr>
+        <w:t xml:space="preserve">Сформулирована задача Коши</w:t>
+      </w:r>
+    </w:p>
+    <w:p>
+      <w:pPr>
+        <w:rPr>
+          <w:b/>
+          <w:bCs/>
+          <w:i/>
+        </w:rPr>
         <w:jc w:val="center"/>
         <w:spacing w:after="120" w:line="276" w:lineRule="auto"/>
       </w:pPr>
@@ -9447,22 +9707,45 @@
         <m:oMath>
           <m:r>
             <m:rPr>
-              <m:sty m:val="b"/>
+              <m:sty m:val="bi"/>
             </m:rPr>
             <w:rPr>
               <w:rFonts w:ascii="Cambria Math" w:hAnsi="Cambria Math"/>
               <w:b/>
               <w:bCs/>
-              <w:sz w:val="28"/>
-              <w:szCs w:val="28"/>
+              <w:i/>
+              <w:iCs/>
+              <w:sz w:val="32"/>
+              <w:szCs w:val="32"/>
             </w:rPr>
-            <m:t xml:space="preserve">di/i = − (R/L) dt</m:t>
+            <m:t xml:space="preserve">di/dt = − (R+r2)/L · I</m:t>
           </m:r>
         </m:oMath>
       </m:oMathPara>
     </w:p>
     <w:p>
       <w:pPr>
+        <w:spacing w:after="160" w:line="276" w:lineRule="auto"/>
+        <w:ind w:firstLine="0"/>
+      </w:pPr>
+      <w:r>
+        <w:rPr>
+          <w:rFonts w:ascii="Times New Roman" w:hAnsi="Times New Roman" w:cs="Times New Roman"/>
+          <w:b/>
+          <w:bCs/>
+          <w:sz w:val="26"/>
+          <w:szCs w:val="26"/>
+        </w:rPr>
+        <w:t xml:space="preserve">Начальные условия</w:t>
+      </w:r>
+    </w:p>
+    <w:p>
+      <w:pPr>
+        <w:rPr>
+          <w:b/>
+          <w:bCs/>
+          <w:i/>
+        </w:rPr>
         <w:jc w:val="center"/>
         <w:spacing w:after="120" w:line="276" w:lineRule="auto"/>
       </w:pPr>
@@ -9473,14 +9756,98 @@
         <m:oMath>
           <m:r>
             <m:rPr>
-              <m:sty m:val="b"/>
+              <m:sty m:val="bi"/>
             </m:rPr>
             <w:rPr>
               <w:rFonts w:ascii="Cambria Math" w:hAnsi="Cambria Math"/>
               <w:b/>
               <w:bCs/>
-              <w:sz w:val="28"/>
-              <w:szCs w:val="28"/>
+              <w:i/>
+              <w:iCs/>
+              <w:sz w:val="32"/>
+              <w:szCs w:val="32"/>
+            </w:rPr>
+            <m:t xml:space="preserve">Iр(0) = E/r1,    t0 = 0</m:t>
+          </m:r>
+        </m:oMath>
+      </m:oMathPara>
+    </w:p>
+    <w:p>
+      <w:pPr>
+        <w:spacing w:after="160" w:line="276" w:lineRule="auto"/>
+        <w:ind w:firstLine="0"/>
+      </w:pPr>
+      <w:r>
+        <w:rPr>
+          <w:rFonts w:ascii="Times New Roman" w:hAnsi="Times New Roman" w:cs="Times New Roman"/>
+          <w:b/>
+          <w:bCs/>
+          <w:sz w:val="26"/>
+          <w:szCs w:val="26"/>
+        </w:rPr>
+        <w:t xml:space="preserve">Решение уравнения</w:t>
+      </w:r>
+    </w:p>
+    <w:p>
+      <w:pPr>
+        <w:rPr>
+          <w:b/>
+          <w:bCs/>
+          <w:i/>
+        </w:rPr>
+        <w:jc w:val="center"/>
+        <w:spacing w:after="120" w:line="276" w:lineRule="auto"/>
+      </w:pPr>
+      <m:oMathPara>
+        <m:oMathParaPr>
+          <m:jc m:val="center"/>
+        </m:oMathParaPr>
+        <m:oMath>
+          <m:r>
+            <m:rPr>
+              <m:sty m:val="bi"/>
+            </m:rPr>
+            <w:rPr>
+              <w:rFonts w:ascii="Cambria Math" w:hAnsi="Cambria Math"/>
+              <w:b/>
+              <w:bCs/>
+              <w:i/>
+              <w:iCs/>
+              <w:sz w:val="32"/>
+              <w:szCs w:val="32"/>
+            </w:rPr>
+            <m:t xml:space="preserve">di/I = − ((R+r2)/L) dt</m:t>
+          </m:r>
+        </m:oMath>
+      </m:oMathPara>
+    </w:p>
+    <w:p>
+      <w:pPr>
+        <w:rPr>
+          <w:b/>
+          <w:bCs/>
+          <w:i/>
+        </w:rPr>
+        <w:jc w:val="center"/>
+        <w:spacing w:after="120" w:line="276" w:lineRule="auto"/>
+      </w:pPr>
+      <m:oMathPara>
+        <m:oMathParaPr>
+          <m:jc m:val="center"/>
+        </m:oMathParaPr>
+        <m:oMath>
+          <m:r>
+            <m:rPr>
+              <m:sty m:val="bi"/>
+            </m:rPr>
+            <w:rPr>
+              <w:rFonts w:ascii="Cambria Math" w:hAnsi="Cambria Math"/>
+              <w:b/>
+              <w:bCs/>
+              <w:i/>
+              <w:iCs/>
+              <w:sz w:val="32"/>
+              <w:szCs w:val="32"/>
             </w:rPr>
             <m:t xml:space="preserve">ln</m:t>
           </m:r>
@@ -9492,37 +9859,46 @@
             <m:e>
               <m:r>
                 <m:rPr>
-                  <m:sty m:val="b"/>
+                  <m:sty m:val="bi"/>
                 </m:rPr>
                 <w:rPr>
                   <w:rFonts w:ascii="Cambria Math" w:hAnsi="Cambria Math"/>
                   <w:b/>
                   <w:bCs/>
-                  <w:sz w:val="28"/>
-                  <w:szCs w:val="28"/>
+                  <w:i/>
+                  <w:iCs/>
+                  <w:sz w:val="32"/>
+                  <w:szCs w:val="32"/>
                 </w:rPr>
-                <m:t xml:space="preserve">i</m:t>
+                <m:t xml:space="preserve">I</m:t>
               </m:r>
             </m:e>
           </m:d>
           <m:r>
             <m:rPr>
-              <m:sty m:val="b"/>
+              <m:sty m:val="bi"/>
             </m:rPr>
             <w:rPr>
               <w:rFonts w:ascii="Cambria Math" w:hAnsi="Cambria Math"/>
               <w:b/>
               <w:bCs/>
-              <w:sz w:val="28"/>
-              <w:szCs w:val="28"/>
+              <w:i/>
+              <w:iCs/>
+              <w:sz w:val="32"/>
+              <w:szCs w:val="32"/>
             </w:rPr>
-            <m:t xml:space="preserve"> = − (R/L)·t + C1</m:t>
+            <m:t xml:space="preserve"> = − ((R+r2)/L)·t + C1</m:t>
           </m:r>
         </m:oMath>
       </m:oMathPara>
     </w:p>
     <w:p>
       <w:pPr>
+        <w:rPr>
+          <w:b/>
+          <w:bCs/>
+          <w:i/>
+        </w:rPr>
         <w:jc w:val="center"/>
         <w:spacing w:after="120" w:line="276" w:lineRule="auto"/>
       </w:pPr>
@@ -9533,22 +9909,29 @@
         <m:oMath>
           <m:r>
             <m:rPr>
-              <m:sty m:val="b"/>
+              <m:sty m:val="bi"/>
             </m:rPr>
             <w:rPr>
               <w:rFonts w:ascii="Cambria Math" w:hAnsi="Cambria Math"/>
               <w:b/>
               <w:bCs/>
-              <w:sz w:val="28"/>
-              <w:szCs w:val="28"/>
+              <w:i/>
+              <w:iCs/>
+              <w:sz w:val="32"/>
+              <w:szCs w:val="32"/>
             </w:rPr>
-            <m:t xml:space="preserve">i(t) = C2 · exp(−t·R/L)</m:t>
+            <m:t xml:space="preserve">I(t) = C2 · exp(−t·(R+r2)/L)</m:t>
           </m:r>
         </m:oMath>
       </m:oMathPara>
     </w:p>
     <w:p>
       <w:pPr>
+        <w:rPr>
+          <w:b/>
+          <w:bCs/>
+          <w:i/>
+        </w:rPr>
         <w:jc w:val="center"/>
         <w:spacing w:after="120" w:line="276" w:lineRule="auto"/>
       </w:pPr>
@@ -9559,16 +9942,18 @@
         <m:oMath>
           <m:r>
             <m:rPr>
-              <m:sty m:val="b"/>
+              <m:sty m:val="bi"/>
             </m:rPr>
             <w:rPr>
               <w:rFonts w:ascii="Cambria Math" w:hAnsi="Cambria Math"/>
               <w:b/>
               <w:bCs/>
-              <w:sz w:val="28"/>
-              <w:szCs w:val="28"/>
+              <w:i/>
+              <w:iCs/>
+              <w:sz w:val="32"/>
+              <w:szCs w:val="32"/>
             </w:rPr>
-            <m:t xml:space="preserve">Iр(0) = E/R  ⇒  C2 = E/R</m:t>
+            <m:t xml:space="preserve">Iр(0) = E/r1  ⇒  C2 = E/r1</m:t>
           </m:r>
         </m:oMath>
       </m:oMathPara>
@@ -9591,6 +9976,11 @@
     </w:p>
     <w:p>
       <w:pPr>
+        <w:rPr>
+          <w:b/>
+          <w:bCs/>
+          <w:i/>
+        </w:rPr>
         <w:jc w:val="center"/>
         <w:spacing w:after="120" w:line="276" w:lineRule="auto"/>
       </w:pPr>
@@ -9601,22 +9991,29 @@
         <m:oMath>
           <m:r>
             <m:rPr>
-              <m:sty m:val="b"/>
+              <m:sty m:val="bi"/>
             </m:rPr>
             <w:rPr>
               <w:rFonts w:ascii="Cambria Math" w:hAnsi="Cambria Math"/>
               <w:b/>
               <w:bCs/>
-              <w:sz w:val="28"/>
-              <w:szCs w:val="28"/>
+              <w:i/>
+              <w:iCs/>
+              <w:sz w:val="32"/>
+              <w:szCs w:val="32"/>
             </w:rPr>
-            <m:t xml:space="preserve">Iр(t) = (E/R) · exp(−t·R/L)</m:t>
+            <m:t xml:space="preserve">Iр(t) = (E/r1) · exp(−t·(R+r2)/L)</m:t>
           </m:r>
         </m:oMath>
       </m:oMathPara>
     </w:p>
     <w:p>
       <w:pPr>
+        <w:rPr>
+          <w:b/>
+          <w:bCs/>
+          <w:i/>
+        </w:rPr>
         <w:jc w:val="center"/>
         <w:spacing w:after="120" w:line="276" w:lineRule="auto"/>
       </w:pPr>
@@ -9627,22 +10024,29 @@
         <m:oMath>
           <m:r>
             <m:rPr>
-              <m:sty m:val="b"/>
+              <m:sty m:val="bi"/>
             </m:rPr>
             <w:rPr>
               <w:rFonts w:ascii="Cambria Math" w:hAnsi="Cambria Math"/>
               <w:b/>
               <w:bCs/>
-              <w:sz w:val="28"/>
-              <w:szCs w:val="28"/>
+              <w:i/>
+              <w:iCs/>
+              <w:sz w:val="32"/>
+              <w:szCs w:val="32"/>
             </w:rPr>
-            <m:t xml:space="preserve">Uр(t) = L·i' = − E · exp(−t·R/L)</m:t>
+            <m:t xml:space="preserve">Uр(t) = L·I' = − (R+r2)·Iр(t)</m:t>
           </m:r>
         </m:oMath>
       </m:oMathPara>
     </w:p>
     <w:p>
       <w:pPr>
+        <w:rPr>
+          <w:b/>
+          <w:bCs/>
+          <w:i/>
+        </w:rPr>
         <w:jc w:val="center"/>
         <w:spacing w:after="120" w:line="276" w:lineRule="auto"/>
       </w:pPr>
@@ -9653,16 +10057,18 @@
         <m:oMath>
           <m:r>
             <m:rPr>
-              <m:sty m:val="b"/>
+              <m:sty m:val="bi"/>
             </m:rPr>
             <w:rPr>
               <w:rFonts w:ascii="Cambria Math" w:hAnsi="Cambria Math"/>
               <w:b/>
               <w:bCs/>
-              <w:sz w:val="28"/>
-              <w:szCs w:val="28"/>
+              <w:i/>
+              <w:iCs/>
+              <w:sz w:val="32"/>
+              <w:szCs w:val="32"/>
             </w:rPr>
-            <m:t xml:space="preserve">Excel:  Iр=(E/R)*EXP(-t*R/L);   Uр=-E*EXP(-t*R/L)</m:t>
+            <m:t xml:space="preserve">Excel:  Iр=(E/r1)*EXP(-t*(R+r2)/L);   Uр=-(R+r2)*Iр</m:t>
           </m:r>
         </m:oMath>
       </m:oMathPara>
@@ -9727,7 +10133,7 @@
           <w:sz w:val="22"/>
           <w:szCs w:val="22"/>
         </w:rPr>
-        <w:t xml:space="preserve">Рис. 6. Ток и напряжение при разряде (шкала 10τр, R = 120 Ом)</w:t>
+        <w:t xml:space="preserve">Рис. 6. Ток и напряжение при разряде (шкала 10τр)</w:t>
       </w:r>
     </w:p>
     <w:p>
@@ -9748,6 +10154,11 @@
     </w:p>
     <w:p>
       <w:pPr>
+        <w:rPr>
+          <w:b/>
+          <w:bCs/>
+          <w:i/>
+        </w:rPr>
         <w:jc w:val="center"/>
         <w:spacing w:after="120" w:line="276" w:lineRule="auto"/>
       </w:pPr>
@@ -9758,16 +10169,18 @@
         <m:oMath>
           <m:r>
             <m:rPr>
-              <m:sty m:val="b"/>
+              <m:sty m:val="bi"/>
             </m:rPr>
             <w:rPr>
               <w:rFonts w:ascii="Cambria Math" w:hAnsi="Cambria Math"/>
               <w:b/>
               <w:bCs/>
-              <w:sz w:val="28"/>
-              <w:szCs w:val="28"/>
+              <w:i/>
+              <w:iCs/>
+              <w:sz w:val="32"/>
+              <w:szCs w:val="32"/>
             </w:rPr>
-            <m:t xml:space="preserve">R = 12 Ом,   L = 9·10⁻⁴ Гн</m:t>
+            <m:t xml:space="preserve">R = 12 Ом,   r2 = 90 Ом,   L = 9·10⁻⁴ Гн</m:t>
           </m:r>
         </m:oMath>
       </m:oMathPara>
@@ -9783,7 +10196,7 @@
           <w:sz w:val="24"/>
           <w:szCs w:val="24"/>
         </w:rPr>
-        <w:t xml:space="preserve">Постоянная τр больше, разряд длится дольше.</w:t>
+        <w:t xml:space="preserve">Постоянная τр = L/(R+r2) больше, разряд длится дольше.</w:t>
       </w:r>
     </w:p>
     <w:p>
@@ -9872,7 +10285,7 @@
           <w:sz w:val="24"/>
           <w:szCs w:val="24"/>
         </w:rPr>
-        <w:t xml:space="preserve">По графикам заряд и разряд катушки идут по экспоненте, как и выходило из уравнения. Пока ключ на источнике, ток нарастает от нуля до E/r ≈ 0,89 А, а напряжение на L в первый момент равно 8 В и быстро падает. У нас L = 9·10⁻⁴ Гн и r = 9 Ом, τз = 10⁻⁴ с — к половине миллисекунды кривые уже почти горизонтальные, дальше считать почти нечего. Разряд через 120 Ом гораздо короче: τр ≈ 7,5 мкс. С тем же шагом, что заряд, на графике от него ничего не остаётся, поэтому разряд я вынес на отдельную шкалу, примерно 10τр.</w:t>
+        <w:t xml:space="preserve">По графикам заряд и разряд катушки идут по экспоненте, как и выходило из уравнения. Пока ключ на источнике, ток нарастает от нуля до E/r1 ≈ 0,89 А, а напряжение на L в первый момент равно 8 В и быстро падает. У нас L = 9·10⁻⁴ Гн и r1 = 9 Ом, τз = 10⁻⁴ с. Разряд идёт через R и лампу Л2, τр = L/(R+r2) ≈ 4,3 мкс. С шагом заряда кривая разряда сразу в нуле, поэтому разряд я вынес на шкалу 10τр.</w:t>
       </w:r>
     </w:p>
     <w:p>
@@ -9886,7 +10299,7 @@
           <w:sz w:val="24"/>
           <w:szCs w:val="24"/>
         </w:rPr>
-        <w:t xml:space="preserve">Когда уменьшал L втрое, ток выходил на полку заметно раньше. При r = 4,5 Ом полка выше, около 1,8 А, переход чуть длиннее. С R = 12 Ом разряд тоже растягивается. Постоянная времени тут просто L, делённая на сопротивление того контура, который сейчас замкнут.</w:t>
+        <w:t xml:space="preserve">Когда уменьшал L втрое, ток выходил на полку заметно раньше. При r1 = 4,5 Ом полка выше, около 1,8 А. С R = 12 Ом разряд растягивается. Постоянная времени — L, делённая на сопротивление того контура, который сейчас замкнут.</w:t>
       </w:r>
     </w:p>
     <w:sectPr>

</xml_diff>